<commit_message>
chore: correct resume source and unify summary copy
Resume/KalebK_FE.docx was stale in three ways: it read 7+ years, listed
the degree as "Bachelor of Science Biological Sciences", and omitted the
Northwestern certificate entirely. Correct all three against the site
data, which was already accurate.

Adopt the newer summary wording ("Frontend SLOs, GenAI, and Agentic
Workflows") in resumeData so the site and the PDF carry an identical
string. GenAI and Agentic Workflows were already in SKILLS, so this
introduces no new terminology.

Delete the root KalebK_FE.pdf, which was byte-identical to the served
public/KalebK_Resume.pdf and only created ambiguity about which copy was
canonical. Nothing referenced it.

Note: Resume/KalebK_FE.pages and the exported PDF still need the same
three corrections applied by hand; Pages files are not editable here.

Co-Authored-By: Claude Opus 5 (1M context) <noreply@anthropic.com>
</commit_message>
<xml_diff>
--- a/Resume/KalebK_FE.docx
+++ b/Resume/KalebK_FE.docx
@@ -195,7 +195,7 @@
             </w14:solidFill>
           </w14:textFill>
         </w:rPr>
-        <w:t>7</w:t>
+        <w:t>8</w:t>
       </w:r>
       <w:r>
         <w:rPr>
@@ -214,7 +214,7 @@
             </w14:solidFill>
           </w14:textFill>
         </w:rPr>
-        <w:t>+ years building scalable TypeScript/React web applications and reusable component libraries. Experienced with Webpack, CI/CD, Core Web Vitals, Frontend SLOs,  GenAI</w:t>
+        <w:t>+ years building scalable TypeScript/React web applications and reusable component libraries. Experienced with Webpack, CI/CD, Core Web Vitals, Frontend SLOs, GenAI</w:t>
       </w:r>
       <w:r>
         <w:rPr>
@@ -1028,7 +1028,7 @@
           <w:rtl w:val="0"/>
           <w:lang w:val="en-US"/>
         </w:rPr>
-        <w:t>University of Arkansas</w:t>
+        <w:t>Northwestern University</w:t>
       </w:r>
       <w:r>
         <w:rPr>
@@ -1036,7 +1036,7 @@
           <w:bCs w:val="0"/>
           <w:rtl w:val="0"/>
         </w:rPr>
-        <w:t xml:space="preserve">    Jul 2017</w:t>
+        <w:t xml:space="preserve">    Jan 2019</w:t>
       </w:r>
     </w:p>
     <w:p>
@@ -1056,16 +1056,64 @@
           <w:rtl w:val="0"/>
           <w:lang w:val="en-US"/>
         </w:rPr>
-        <w:t>Bachelor of Science</w:t>
-      </w:r>
-      <w:r>
+        <w:t>Full-Stack Web Development Certificate</w:t>
+      </w:r>
+    </w:p>
+    <w:p>
+      <w:pPr>
+        <w:pStyle w:val="Heading 2"/>
         <w:rPr>
           <w:b w:val="0"/>
           <w:bCs w:val="0"/>
-          <w:rtl w:val="0"/>
-          <w:lang w:val="en-US"/>
-        </w:rPr>
-        <w:t xml:space="preserve"> Biological Sciences</w:t>
+        </w:rPr>
+      </w:pPr>
+      <w:r>
+        <w:rPr>
+          <w:rStyle w:val="None"/>
+          <w:rFonts w:ascii="Times New Roman" w:hAnsi="Times New Roman"/>
+          <w:b w:val="0"/>
+          <w:bCs w:val="0"/>
+          <w:rtl w:val="0"/>
+          <w:lang w:val="en-US"/>
+        </w:rPr>
+        <w:t>University of Arkansas</w:t>
+      </w:r>
+      <w:r>
+        <w:rPr>
+          <w:b w:val="0"/>
+          <w:bCs w:val="0"/>
+          <w:rtl w:val="0"/>
+        </w:rPr>
+        <w:t xml:space="preserve">    Jul 2017</w:t>
+      </w:r>
+    </w:p>
+    <w:p>
+      <w:pPr>
+        <w:pStyle w:val="Heading 2"/>
+        <w:rPr>
+          <w:b w:val="0"/>
+          <w:bCs w:val="0"/>
+        </w:rPr>
+      </w:pPr>
+      <w:r>
+        <w:rPr>
+          <w:rStyle w:val="None"/>
+          <w:rFonts w:ascii="Times New Roman" w:hAnsi="Times New Roman"/>
+          <w:b w:val="0"/>
+          <w:bCs w:val="0"/>
+          <w:rtl w:val="0"/>
+          <w:lang w:val="en-US"/>
+        </w:rPr>
+        <w:t>Bachelor of Science</w:t>
+      </w:r>
+      <w:r>
+        <w:rPr>
+          <w:b w:val="0"/>
+          <w:bCs w:val="0"/>
+          <w:rtl w:val="0"/>
+          <w:lang w:val="en-US"/>
+        </w:rPr>
+        <w:t xml:space="preserve">, Cum Laude</w:t>
       </w:r>
     </w:p>
     <w:p>

</xml_diff>